<commit_message>
docs: update screenshots and pipeline links
[skip ci]
</commit_message>
<xml_diff>
--- a/docs/report.docx
+++ b/docs/report.docx
@@ -2830,7 +2830,7 @@
           <w:sz w:val="28"/>
           <w:u w:val="none"/>
         </w:rPr>
-        <w:t>Скриншоты сделаны для запуска #54 (коммит d3a069c). Отчёты SpotBugs и Dependency-Check взяты из артефактов этого запуска.</w:t>
+        <w:t>Скриншоты сделаны для запуска #54 (коммит d3a069c): https://github.com/r4m63/infobez-itmo/actions/runs/36620490824/job/109584335296. Отчёты SpotBugs и Dependency-Check взяты из артефактов этого запуска.</w:t>
       </w:r>
     </w:p>
     <w:p>
@@ -2842,7 +2842,7 @@
       <w:r>
         <w:drawing>
           <wp:inline xmlns:a="http://schemas.openxmlformats.org/drawingml/2006/main" xmlns:pic="http://schemas.openxmlformats.org/drawingml/2006/picture">
-            <wp:extent cx="6120000" cy="4887500"/>
+            <wp:extent cx="6120000" cy="3993300"/>
             <wp:docPr id="1" name="Picture 1"/>
             <wp:cNvGraphicFramePr>
               <a:graphicFrameLocks noChangeAspect="1"/>
@@ -2863,7 +2863,7 @@
                   <pic:spPr>
                     <a:xfrm>
                       <a:off x="0" y="0"/>
-                      <a:ext cx="6120000" cy="4887500"/>
+                      <a:ext cx="6120000" cy="3993300"/>
                     </a:xfrm>
                     <a:prstGeom prst="rect"/>
                   </pic:spPr>
@@ -2963,7 +2963,7 @@
           <w:sz w:val="28"/>
           <w:u w:val="none"/>
         </w:rPr>
-        <w:t>На рисунке 1 видно, что все три задачи завершились успешно. На рисунке 2 показана история запусков: pipeline срабатывает на каждый push.</w:t>
+        <w:t>На рисунке 1 видно, что все три задачи завершились успешно, а в Job Summary задачи SAST указано 0 найденных проблем. На рисунке 2 показана история запусков: pipeline срабатывает на каждый push.</w:t>
       </w:r>
     </w:p>
     <w:p>
@@ -2975,7 +2975,7 @@
       <w:r>
         <w:drawing>
           <wp:inline xmlns:a="http://schemas.openxmlformats.org/drawingml/2006/main" xmlns:pic="http://schemas.openxmlformats.org/drawingml/2006/picture">
-            <wp:extent cx="6120000" cy="4590000"/>
+            <wp:extent cx="6120000" cy="3993300"/>
             <wp:docPr id="3" name="Picture 3"/>
             <wp:cNvGraphicFramePr>
               <a:graphicFrameLocks noChangeAspect="1"/>
@@ -2996,7 +2996,7 @@
                   <pic:spPr>
                     <a:xfrm>
                       <a:off x="0" y="0"/>
-                      <a:ext cx="6120000" cy="4590000"/>
+                      <a:ext cx="6120000" cy="3993300"/>
                     </a:xfrm>
                     <a:prstGeom prst="rect"/>
                   </pic:spPr>
@@ -3050,7 +3050,7 @@
       <w:r>
         <w:drawing>
           <wp:inline xmlns:a="http://schemas.openxmlformats.org/drawingml/2006/main" xmlns:pic="http://schemas.openxmlformats.org/drawingml/2006/picture">
-            <wp:extent cx="6120000" cy="3400000"/>
+            <wp:extent cx="6120000" cy="3993300"/>
             <wp:docPr id="4" name="Picture 4"/>
             <wp:cNvGraphicFramePr>
               <a:graphicFrameLocks noChangeAspect="1"/>
@@ -3071,7 +3071,7 @@
                   <pic:spPr>
                     <a:xfrm>
                       <a:off x="0" y="0"/>
-                      <a:ext cx="6120000" cy="3400000"/>
+                      <a:ext cx="6120000" cy="3993300"/>
                     </a:xfrm>
                     <a:prstGeom prst="rect"/>
                   </pic:spPr>
@@ -4030,24 +4030,7 @@
           <w:sz w:val="28"/>
           <w:u w:val="none"/>
         </w:rPr>
-        <w:t>Запуск #54 workflow Build and Security Checks: https://github.com/r4m63/infobez-itmo/actions/runs/36620490824.</w:t>
-      </w:r>
-    </w:p>
-    <w:p>
-      <w:pPr>
-        <w:spacing w:line="360" w:lineRule="auto" w:before="0" w:after="0"/>
-        <w:ind w:firstLine="709"/>
-        <w:jc w:val="both"/>
-      </w:pPr>
-      <w:r>
-        <w:rPr>
-          <w:rFonts w:ascii="Times New Roman" w:hAnsi="Times New Roman" w:cs="Times New Roman" w:eastAsia="Times New Roman"/>
-          <w:b w:val="0"/>
-          <w:i w:val="0"/>
-          <w:sz w:val="28"/>
-          <w:u w:val="none"/>
-        </w:rPr>
-        <w:t>Все успешные запуски: https://github.com/r4m63/infobez-itmo/actions/workflows/ci.yml?query=is%3Asuccess.</w:t>
+        <w:t>Запуск #54 workflow Build and Security Checks: https://github.com/r4m63/infobez-itmo/actions/runs/36620490824/job/109584335296.</w:t>
       </w:r>
     </w:p>
     <w:p>

</xml_diff>

<commit_message>
docs: remove workflow history screenshot
[skip ci]
</commit_message>
<xml_diff>
--- a/docs/report.docx
+++ b/docs/report.docx
@@ -2893,6 +2893,23 @@
     </w:p>
     <w:p>
       <w:pPr>
+        <w:spacing w:line="360" w:lineRule="auto" w:before="0" w:after="0"/>
+        <w:ind w:firstLine="709"/>
+        <w:jc w:val="both"/>
+      </w:pPr>
+      <w:r>
+        <w:rPr>
+          <w:rFonts w:ascii="Times New Roman" w:hAnsi="Times New Roman" w:cs="Times New Roman" w:eastAsia="Times New Roman"/>
+          <w:b w:val="0"/>
+          <w:i w:val="0"/>
+          <w:sz w:val="28"/>
+          <w:u w:val="none"/>
+        </w:rPr>
+        <w:t>На рисунке 1 видно, что все три задачи завершились успешно, а в Job Summary задачи SAST указано 0 найденных проблем.</w:t>
+      </w:r>
+    </w:p>
+    <w:p>
+      <w:pPr>
         <w:spacing w:line="360" w:lineRule="auto" w:before="120" w:after="0"/>
         <w:ind w:firstLine="0"/>
         <w:jc w:val="center"/>
@@ -2900,7 +2917,7 @@
       <w:r>
         <w:drawing>
           <wp:inline xmlns:a="http://schemas.openxmlformats.org/drawingml/2006/main" xmlns:pic="http://schemas.openxmlformats.org/drawingml/2006/picture">
-            <wp:extent cx="6120000" cy="4675000"/>
+            <wp:extent cx="6120000" cy="3993300"/>
             <wp:docPr id="2" name="Picture 2"/>
             <wp:cNvGraphicFramePr>
               <a:graphicFrameLocks noChangeAspect="1"/>
@@ -2909,7 +2926,7 @@
               <a:graphicData uri="http://schemas.openxmlformats.org/drawingml/2006/picture">
                 <pic:pic>
                   <pic:nvPicPr>
-                    <pic:cNvPr id="0" name="02-actions-list.png"/>
+                    <pic:cNvPr id="0" name="04-spotbugs-report.png"/>
                     <pic:cNvPicPr/>
                   </pic:nvPicPr>
                   <pic:blipFill>
@@ -2921,7 +2938,7 @@
                   <pic:spPr>
                     <a:xfrm>
                       <a:off x="0" y="0"/>
-                      <a:ext cx="6120000" cy="4675000"/>
+                      <a:ext cx="6120000" cy="3993300"/>
                     </a:xfrm>
                     <a:prstGeom prst="rect"/>
                   </pic:spPr>
@@ -2946,7 +2963,7 @@
           <w:sz w:val="28"/>
           <w:u w:val="none"/>
         </w:rPr>
-        <w:t>Рисунок 2 — История запусков workflow Build and Security Checks</w:t>
+        <w:t>Рисунок 2 — Отчёт SpotBugs и Find Security Bugs из CI</w:t>
       </w:r>
     </w:p>
     <w:p>
@@ -2963,7 +2980,7 @@
           <w:sz w:val="28"/>
           <w:u w:val="none"/>
         </w:rPr>
-        <w:t>На рисунке 1 видно, что все три задачи завершились успешно, а в Job Summary задачи SAST указано 0 найденных проблем. На рисунке 2 показана история запусков: pipeline срабатывает на каждый push.</w:t>
+        <w:t>На рисунке 2 приведён отчёт SAST: проанализирован 171 строка кода в 9 классах, замечаний высокого и среднего приоритета нет.</w:t>
       </w:r>
     </w:p>
     <w:p>
@@ -2984,7 +3001,7 @@
               <a:graphicData uri="http://schemas.openxmlformats.org/drawingml/2006/picture">
                 <pic:pic>
                   <pic:nvPicPr>
-                    <pic:cNvPr id="0" name="04-spotbugs-report.png"/>
+                    <pic:cNvPr id="0" name="05-dependency-check-report.png"/>
                     <pic:cNvPicPr/>
                   </pic:nvPicPr>
                   <pic:blipFill>
@@ -3021,7 +3038,7 @@
           <w:sz w:val="28"/>
           <w:u w:val="none"/>
         </w:rPr>
-        <w:t>Рисунок 3 — Отчёт SpotBugs и Find Security Bugs из CI</w:t>
+        <w:t>Рисунок 3 — Отчёт OWASP Dependency-Check из CI</w:t>
       </w:r>
     </w:p>
     <w:p>
@@ -3038,82 +3055,7 @@
           <w:sz w:val="28"/>
           <w:u w:val="none"/>
         </w:rPr>
-        <w:t>На рисунке 3 приведён отчёт SAST: проанализирован 171 строка кода в 9 классах, замечаний высокого и среднего приоритета нет.</w:t>
-      </w:r>
-    </w:p>
-    <w:p>
-      <w:pPr>
-        <w:spacing w:line="360" w:lineRule="auto" w:before="120" w:after="0"/>
-        <w:ind w:firstLine="0"/>
-        <w:jc w:val="center"/>
-      </w:pPr>
-      <w:r>
-        <w:drawing>
-          <wp:inline xmlns:a="http://schemas.openxmlformats.org/drawingml/2006/main" xmlns:pic="http://schemas.openxmlformats.org/drawingml/2006/picture">
-            <wp:extent cx="6120000" cy="3993300"/>
-            <wp:docPr id="4" name="Picture 4"/>
-            <wp:cNvGraphicFramePr>
-              <a:graphicFrameLocks noChangeAspect="1"/>
-            </wp:cNvGraphicFramePr>
-            <a:graphic>
-              <a:graphicData uri="http://schemas.openxmlformats.org/drawingml/2006/picture">
-                <pic:pic>
-                  <pic:nvPicPr>
-                    <pic:cNvPr id="0" name="05-dependency-check-report.png"/>
-                    <pic:cNvPicPr/>
-                  </pic:nvPicPr>
-                  <pic:blipFill>
-                    <a:blip r:embed="rId15"/>
-                    <a:stretch>
-                      <a:fillRect/>
-                    </a:stretch>
-                  </pic:blipFill>
-                  <pic:spPr>
-                    <a:xfrm>
-                      <a:off x="0" y="0"/>
-                      <a:ext cx="6120000" cy="3993300"/>
-                    </a:xfrm>
-                    <a:prstGeom prst="rect"/>
-                  </pic:spPr>
-                </pic:pic>
-              </a:graphicData>
-            </a:graphic>
-          </wp:inline>
-        </w:drawing>
-      </w:r>
-    </w:p>
-    <w:p>
-      <w:pPr>
-        <w:spacing w:line="360" w:lineRule="auto" w:before="0" w:after="120"/>
-        <w:ind w:firstLine="0"/>
-        <w:jc w:val="center"/>
-      </w:pPr>
-      <w:r>
-        <w:rPr>
-          <w:rFonts w:ascii="Times New Roman" w:hAnsi="Times New Roman" w:cs="Times New Roman" w:eastAsia="Times New Roman"/>
-          <w:b w:val="0"/>
-          <w:i w:val="0"/>
-          <w:sz w:val="28"/>
-          <w:u w:val="none"/>
-        </w:rPr>
-        <w:t>Рисунок 4 — Отчёт OWASP Dependency-Check из CI</w:t>
-      </w:r>
-    </w:p>
-    <w:p>
-      <w:pPr>
-        <w:spacing w:line="360" w:lineRule="auto" w:before="0" w:after="0"/>
-        <w:ind w:firstLine="709"/>
-        <w:jc w:val="both"/>
-      </w:pPr>
-      <w:r>
-        <w:rPr>
-          <w:rFonts w:ascii="Times New Roman" w:hAnsi="Times New Roman" w:cs="Times New Roman" w:eastAsia="Times New Roman"/>
-          <w:b w:val="0"/>
-          <w:i w:val="0"/>
-          <w:sz w:val="28"/>
-          <w:u w:val="none"/>
-        </w:rPr>
-        <w:t>На рисунке 4 приведён отчёт SCA: проверено 95 зависимостей (49 уникальных), уязвимых зависимостей 0.</w:t>
+        <w:t>На рисунке 3 приведён отчёт SCA: проверено 95 зависимостей (49 уникальных), уязвимых зависимостей 0.</w:t>
       </w:r>
     </w:p>
     <w:p>

</xml_diff>